<commit_message>
Optimize mobile loading and add prominent contact actions
</commit_message>
<xml_diff>
--- a/assets/Moc83-Speisekarte.docx
+++ b/assets/Moc83-Speisekarte.docx
@@ -37586,7 +37586,7 @@
           <w:szCs w:val="36"/>
           <w:lang w:val="de-DE"/>
         </w:rPr>
-        <w:t>6,90   31,50</w:t>
+        <w:t>6,90   22,50</w:t>
       </w:r>
     </w:p>
     <w:p>
@@ -37955,7 +37955,7 @@
           <w:szCs w:val="32"/>
           <w:lang w:val="de-DE"/>
         </w:rPr>
-        <w:t>31</w:t>
+        <w:t>22</w:t>
       </w:r>
       <w:r>
         <w:rPr>

</xml_diff>